<commit_message>
CHƯƠNG 2: Mô hình hóa quy trình
</commit_message>
<xml_diff>
--- a/docs/1. Liệt kê các quy trình nghiệp vụ.docx
+++ b/docs/1. Liệt kê các quy trình nghiệp vụ.docx
@@ -4,11 +4,10 @@
   <w:body>
     <w:p>
       <w:pPr>
+        <w:pStyle w:val="Heading2"/>
         <w:rPr>
           <w:rFonts w:ascii="Times New Roman" w:hAnsi="Times New Roman" w:cs="Times New Roman"/>
           <w:b/>
-          <w:bCs/>
-          <w:color w:val="000000"/>
           <w:sz w:val="32"/>
           <w:szCs w:val="32"/>
         </w:rPr>
@@ -17,8 +16,6 @@
         <w:rPr>
           <w:rFonts w:ascii="Times New Roman" w:hAnsi="Times New Roman" w:cs="Times New Roman"/>
           <w:b/>
-          <w:bCs/>
-          <w:color w:val="000000"/>
           <w:sz w:val="32"/>
           <w:szCs w:val="32"/>
         </w:rPr>
@@ -169,7 +166,22 @@
           <w:lang w:val="en-US"/>
           <w14:ligatures w14:val="none"/>
         </w:rPr>
-        <w:t>Quy trình Hoạch định Chiến lược Kinh doanh</w:t>
+        <w:t xml:space="preserve">Quy trình </w:t>
+      </w:r>
+      <w:bookmarkStart w:id="0" w:name="_GoBack"/>
+      <w:bookmarkEnd w:id="0"/>
+      <w:r>
+        <w:rPr>
+          <w:rFonts w:ascii="Times New Roman" w:eastAsia="Times New Roman" w:hAnsi="Times New Roman" w:cs="Times New Roman"/>
+          <w:b/>
+          <w:bCs/>
+          <w:kern w:val="0"/>
+          <w:sz w:val="27"/>
+          <w:szCs w:val="27"/>
+          <w:lang w:val="en-US"/>
+          <w14:ligatures w14:val="none"/>
+        </w:rPr>
+        <w:t>Hoạch định Chiến lược Kinh doanh</w:t>
       </w:r>
     </w:p>
     <w:p>
@@ -1035,7 +1047,6 @@
           <w:lang w:val="en-US"/>
           <w14:ligatures w14:val="none"/>
         </w:rPr>
-        <w:lastRenderedPageBreak/>
         <w:t>CEO:</w:t>
       </w:r>
       <w:r>
@@ -1077,6 +1088,7 @@
           <w:lang w:val="en-US"/>
           <w14:ligatures w14:val="none"/>
         </w:rPr>
+        <w:lastRenderedPageBreak/>
         <w:t>Giám đốc Vận hành (COO):</w:t>
       </w:r>
       <w:r>
@@ -3891,8 +3903,6 @@
       <w:r>
         <w:t xml:space="preserve"> Shipper vận chuyển an toàn, giao đồ uống đúng hẹn cho khách.</w:t>
       </w:r>
-      <w:bookmarkStart w:id="0" w:name="_GoBack"/>
-      <w:bookmarkEnd w:id="0"/>
     </w:p>
     <w:p>
       <w:pPr>

</xml_diff>